<commit_message>
Update duration gap analysis with corrected asset duration calculation
Key corrections:
- Asset duration: changed from constant 2.344 to actual values (2.551→2.605, +2.1%)
- Liability duration: updated to accurate values (2.129→1.673, -21.4%)
- Duration gap: corrected to 0.590→1.064 (+80%)
- Updated explanation: liability duration decrease is the main driver, not the only factor
- Removed incorrect claim that "asset duration remained stable"

All data tables, trend analysis, and conclusions updated accordingly.
The core finding remains unchanged: duration gap expansion is highly consistent
with net interest margin contraction.
</commit_message>
<xml_diff>
--- a/招商银行久期缺口分析报告.docx
+++ b/招商银行久期缺口分析报告.docx
@@ -767,19 +767,19 @@
               <w:jc w:val="left"/>
             </w:pPr>
             <w:r>
-              <w:t xml:space="preserve">2.344</w:t>
-            </w:r>
-          </w:p>
-        </w:tc>
-        <w:tc>
-          <w:tcPr/>
-          <w:p>
-            <w:pPr>
-              <w:pStyle w:val="Compact"/>
-              <w:jc w:val="left"/>
-            </w:pPr>
-            <w:r>
-              <w:t xml:space="preserve">1.903</w:t>
+              <w:t xml:space="preserve">2.551</w:t>
+            </w:r>
+          </w:p>
+        </w:tc>
+        <w:tc>
+          <w:tcPr/>
+          <w:p>
+            <w:pPr>
+              <w:pStyle w:val="Compact"/>
+              <w:jc w:val="left"/>
+            </w:pPr>
+            <w:r>
+              <w:t xml:space="preserve">2.129</w:t>
             </w:r>
           </w:p>
         </w:tc>
@@ -795,7 +795,7 @@
                 <w:bCs/>
                 <w:b/>
               </w:rPr>
-              <w:t xml:space="preserve">0.582</w:t>
+              <w:t xml:space="preserve">0.590</w:t>
             </w:r>
           </w:p>
         </w:tc>
@@ -833,19 +833,19 @@
               <w:jc w:val="left"/>
             </w:pPr>
             <w:r>
-              <w:t xml:space="preserve">2.344</w:t>
-            </w:r>
-          </w:p>
-        </w:tc>
-        <w:tc>
-          <w:tcPr/>
-          <w:p>
-            <w:pPr>
-              <w:pStyle w:val="Compact"/>
-              <w:jc w:val="left"/>
-            </w:pPr>
-            <w:r>
-              <w:t xml:space="preserve">1.731</w:t>
+              <w:t xml:space="preserve">2.556</w:t>
+            </w:r>
+          </w:p>
+        </w:tc>
+        <w:tc>
+          <w:tcPr/>
+          <w:p>
+            <w:pPr>
+              <w:pStyle w:val="Compact"/>
+              <w:jc w:val="left"/>
+            </w:pPr>
+            <w:r>
+              <w:t xml:space="preserve">1.965</w:t>
             </w:r>
           </w:p>
         </w:tc>
@@ -861,7 +861,7 @@
                 <w:bCs/>
                 <w:b/>
               </w:rPr>
-              <w:t xml:space="preserve">0.750</w:t>
+              <w:t xml:space="preserve">0.747</w:t>
             </w:r>
           </w:p>
         </w:tc>
@@ -899,19 +899,19 @@
               <w:jc w:val="left"/>
             </w:pPr>
             <w:r>
-              <w:t xml:space="preserve">2.344</w:t>
-            </w:r>
-          </w:p>
-        </w:tc>
-        <w:tc>
-          <w:tcPr/>
-          <w:p>
-            <w:pPr>
-              <w:pStyle w:val="Compact"/>
-              <w:jc w:val="left"/>
-            </w:pPr>
-            <w:r>
-              <w:t xml:space="preserve">1.610</w:t>
+              <w:t xml:space="preserve">2.571</w:t>
+            </w:r>
+          </w:p>
+        </w:tc>
+        <w:tc>
+          <w:tcPr/>
+          <w:p>
+            <w:pPr>
+              <w:pStyle w:val="Compact"/>
+              <w:jc w:val="left"/>
+            </w:pPr>
+            <w:r>
+              <w:t xml:space="preserve">1.861</w:t>
             </w:r>
           </w:p>
         </w:tc>
@@ -927,7 +927,7 @@
                 <w:bCs/>
                 <w:b/>
               </w:rPr>
-              <w:t xml:space="preserve">0.870</w:t>
+              <w:t xml:space="preserve">0.857</w:t>
             </w:r>
           </w:p>
         </w:tc>
@@ -965,19 +965,19 @@
               <w:jc w:val="left"/>
             </w:pPr>
             <w:r>
-              <w:t xml:space="preserve">2.344</w:t>
-            </w:r>
-          </w:p>
-        </w:tc>
-        <w:tc>
-          <w:tcPr/>
-          <w:p>
-            <w:pPr>
-              <w:pStyle w:val="Compact"/>
-              <w:jc w:val="left"/>
-            </w:pPr>
-            <w:r>
-              <w:t xml:space="preserve">1.410</w:t>
+              <w:t xml:space="preserve">2.581</w:t>
+            </w:r>
+          </w:p>
+        </w:tc>
+        <w:tc>
+          <w:tcPr/>
+          <w:p>
+            <w:pPr>
+              <w:pStyle w:val="Compact"/>
+              <w:jc w:val="left"/>
+            </w:pPr>
+            <w:r>
+              <w:t xml:space="preserve">1.681</w:t>
             </w:r>
           </w:p>
         </w:tc>
@@ -993,7 +993,7 @@
                 <w:bCs/>
                 <w:b/>
               </w:rPr>
-              <w:t xml:space="preserve">1.055</w:t>
+              <w:t xml:space="preserve">1.032</w:t>
             </w:r>
           </w:p>
         </w:tc>
@@ -1031,19 +1031,19 @@
               <w:jc w:val="left"/>
             </w:pPr>
             <w:r>
-              <w:t xml:space="preserve">2.344</w:t>
-            </w:r>
-          </w:p>
-        </w:tc>
-        <w:tc>
-          <w:tcPr/>
-          <w:p>
-            <w:pPr>
-              <w:pStyle w:val="Compact"/>
-              <w:jc w:val="left"/>
-            </w:pPr>
-            <w:r>
-              <w:t xml:space="preserve">1.375</w:t>
+              <w:t xml:space="preserve">2.605</w:t>
+            </w:r>
+          </w:p>
+        </w:tc>
+        <w:tc>
+          <w:tcPr/>
+          <w:p>
+            <w:pPr>
+              <w:pStyle w:val="Compact"/>
+              <w:jc w:val="left"/>
+            </w:pPr>
+            <w:r>
+              <w:t xml:space="preserve">1.673</w:t>
             </w:r>
           </w:p>
         </w:tc>
@@ -1059,7 +1059,7 @@
                 <w:bCs/>
                 <w:b/>
               </w:rPr>
-              <w:t xml:space="preserve">1.102</w:t>
+              <w:t xml:space="preserve">1.064</w:t>
             </w:r>
           </w:p>
         </w:tc>
@@ -1111,17 +1111,17 @@
         <w:pStyle w:val="FirstParagraph"/>
       </w:pPr>
       <w:r>
-        <w:t xml:space="preserve">久期缺口从2019年的0.582年持续扩大到2023年的1.102年，</w:t>
-      </w:r>
-      <w:r>
-        <w:rPr>
-          <w:bCs/>
-          <w:b/>
-        </w:rPr>
-        <w:t xml:space="preserve">整整增长了89%</w:t>
-      </w:r>
-      <w:r>
-        <w:t xml:space="preserve">（+0.520年）！</w:t>
+        <w:t xml:space="preserve">久期缺口从2019年的0.590年持续扩大到2023年的1.064年，</w:t>
+      </w:r>
+      <w:r>
+        <w:rPr>
+          <w:bCs/>
+          <w:b/>
+        </w:rPr>
+        <w:t xml:space="preserve">增长了80%</w:t>
+      </w:r>
+      <w:r>
+        <w:t xml:space="preserve">（+0.474年）！</w:t>
       </w:r>
     </w:p>
     <w:p>
@@ -1143,31 +1143,31 @@
         <w:t xml:space="preserve"> </w:t>
       </w:r>
       <w:r>
-        <w:t xml:space="preserve">- 2019年：如果市场利率上升1%，银行净值大约会损失0.582%</w:t>
-      </w:r>
-      <w:r>
-        <w:t xml:space="preserve"> </w:t>
-      </w:r>
-      <w:r>
-        <w:t xml:space="preserve">- 2023年：如果市场利率上升1%，银行净值大约会损失1.102%</w:t>
-      </w:r>
-    </w:p>
-    <w:p>
-      <w:pPr>
-        <w:pStyle w:val="BodyText"/>
-      </w:pPr>
-      <w:r>
-        <w:t xml:space="preserve">风险暴露几乎翻了一倍！</w:t>
+        <w:t xml:space="preserve">- 2019年：如果市场利率上升1%，银行净值大约会损失0.590%</w:t>
+      </w:r>
+      <w:r>
+        <w:t xml:space="preserve"> </w:t>
+      </w:r>
+      <w:r>
+        <w:t xml:space="preserve">- 2023年：如果市场利率上升1%，银行净值大约会损失1.064%</w:t>
+      </w:r>
+    </w:p>
+    <w:p>
+      <w:pPr>
+        <w:pStyle w:val="BodyText"/>
+      </w:pPr>
+      <w:r>
+        <w:t xml:space="preserve">风险暴露增加了80%！</w:t>
       </w:r>
     </w:p>
     <w:bookmarkEnd w:id="26"/>
-    <w:bookmarkStart w:id="27" w:name="关键发现2资产久期稳定负债久期快速下降"/>
+    <w:bookmarkStart w:id="27" w:name="关键发现2资产久期小幅上升负债久期大幅下降"/>
     <w:p>
       <w:pPr>
         <w:pStyle w:val="Heading4"/>
       </w:pPr>
       <w:r>
-        <w:t xml:space="preserve">关键发现2：资产久期稳定，负债久期快速下降</w:t>
+        <w:t xml:space="preserve">关键发现2：资产久期小幅上升，负债久期大幅下降</w:t>
       </w:r>
     </w:p>
     <w:p>
@@ -1194,7 +1194,7 @@
         <w:t xml:space="preserve">资产久期</w:t>
       </w:r>
       <w:r>
-        <w:t xml:space="preserve">：五年间一直保持在2.344年，非常稳定</w:t>
+        <w:t xml:space="preserve">：从2.551年小幅上升到2.605年，增长了2.1%</w:t>
       </w:r>
       <w:r>
         <w:t xml:space="preserve"> </w:t>
@@ -1213,7 +1213,7 @@
         <w:t xml:space="preserve">负债久期</w:t>
       </w:r>
       <w:r>
-        <w:t xml:space="preserve">：从1.903年快速下降到1.375年，下降了28%</w:t>
+        <w:t xml:space="preserve">：从2.129年大幅下降到1.673年，下降了21.4%</w:t>
       </w:r>
     </w:p>
     <w:p>
@@ -1233,31 +1233,31 @@
           <w:bCs/>
           <w:b/>
         </w:rPr>
-        <w:t xml:space="preserve">资产久期稳定</w:t>
-      </w:r>
-      <w:r>
-        <w:t xml:space="preserve"> </w:t>
-      </w:r>
-      <w:r>
-        <w:t xml:space="preserve">说明招商银行的资产结构（主要是贷款组合）比较稳定。企业贷款、个人贷款的期限结构这五年没有发生大的变化。这是合理的，因为资产端调整需要时间，而且受到市场需求的约束。</w:t>
-      </w:r>
-    </w:p>
-    <w:p>
-      <w:pPr>
-        <w:pStyle w:val="BodyText"/>
-      </w:pPr>
-      <w:r>
-        <w:rPr>
-          <w:bCs/>
-          <w:b/>
-        </w:rPr>
-        <w:t xml:space="preserve">负债久期快速下降</w:t>
-      </w:r>
-      <w:r>
-        <w:t xml:space="preserve"> </w:t>
-      </w:r>
-      <w:r>
-        <w:t xml:space="preserve">则反映了一个重要趋势：</w:t>
+        <w:t xml:space="preserve">资产久期小幅上升</w:t>
+      </w:r>
+      <w:r>
+        <w:t xml:space="preserve"> </w:t>
+      </w:r>
+      <w:r>
+        <w:t xml:space="preserve">说明招商银行的资产结构（主要是贷款组合）在向更长期限倾斜。这可能反映了几个因素：一是中长期贷款需求增加（如基建、制造业升级），二是银行主动调整资产结构以获取更高收益，三是经济下行期优质短期资产减少。不过，上升幅度只有2.1%，变化相对温和。</w:t>
+      </w:r>
+    </w:p>
+    <w:p>
+      <w:pPr>
+        <w:pStyle w:val="BodyText"/>
+      </w:pPr>
+      <w:r>
+        <w:rPr>
+          <w:bCs/>
+          <w:b/>
+        </w:rPr>
+        <w:t xml:space="preserve">负债久期大幅下降</w:t>
+      </w:r>
+      <w:r>
+        <w:t xml:space="preserve"> </w:t>
+      </w:r>
+      <w:r>
+        <w:t xml:space="preserve">则反映了一个更加显著的趋势：</w:t>
       </w:r>
       <w:r>
         <w:rPr>
@@ -1265,6 +1265,16 @@
           <w:b/>
         </w:rPr>
         <w:t xml:space="preserve">存款短期化</w:t>
+      </w:r>
+      <w:r>
+        <w:t xml:space="preserve">。负债久期下降了21.4%，这是久期缺口扩大的</w:t>
+      </w:r>
+      <w:r>
+        <w:rPr>
+          <w:bCs/>
+          <w:b/>
+        </w:rPr>
+        <w:t xml:space="preserve">主要驱动力</w:t>
       </w:r>
       <w:r>
         <w:t xml:space="preserve">。</w:t>
@@ -1280,13 +1290,13 @@
     </w:p>
     <w:bookmarkEnd w:id="27"/>
     <w:bookmarkEnd w:id="28"/>
-    <w:bookmarkStart w:id="30" w:name="负债久期为什么快速下降"/>
+    <w:bookmarkStart w:id="30" w:name="负债久期为什么大幅下降"/>
     <w:p>
       <w:pPr>
         <w:pStyle w:val="Heading3"/>
       </w:pPr>
       <w:r>
-        <w:t xml:space="preserve">2.3 负债久期为什么快速下降？</w:t>
+        <w:t xml:space="preserve">2.3 负债久期为什么大幅下降？</w:t>
       </w:r>
     </w:p>
     <w:p>
@@ -1294,7 +1304,7 @@
         <w:pStyle w:val="FirstParagraph"/>
       </w:pPr>
       <w:r>
-        <w:t xml:space="preserve">负债久期从1.903年降到1.375年，意味着银行的负债期限在变短。具体来说就是：</w:t>
+        <w:t xml:space="preserve">负债久期从2.129年降到1.673年，意味着银行的负债期限在显著变短。具体来说就是：</w:t>
       </w:r>
     </w:p>
     <w:p>
@@ -1394,17 +1404,17 @@
         <w:pStyle w:val="BodyText"/>
       </w:pPr>
       <w:r>
-        <w:t xml:space="preserve">这些因素叠加在一起，导致负债久期快速下降。而</w:t>
-      </w:r>
-      <w:r>
-        <w:rPr>
-          <w:bCs/>
-          <w:b/>
-        </w:rPr>
-        <w:t xml:space="preserve">资产久期保持稳定+负债久期快速下降=久期缺口快速扩大</w:t>
-      </w:r>
-      <w:r>
-        <w:t xml:space="preserve">。</w:t>
+        <w:t xml:space="preserve">这些因素叠加在一起，导致负债久期大幅下降。而</w:t>
+      </w:r>
+      <w:r>
+        <w:rPr>
+          <w:bCs/>
+          <w:b/>
+        </w:rPr>
+        <w:t xml:space="preserve">资产久期小幅上升（+2.1%）+负债久期大幅下降（-21.4%）=久期缺口快速扩大（+80%）</w:t>
+      </w:r>
+      <w:r>
+        <w:t xml:space="preserve">。其中，负债久期下降是主要驱动力。</w:t>
       </w:r>
     </w:p>
     <w:bookmarkStart w:id="29" w:name="关键发现3正久期缺口的含义"/>
@@ -1710,19 +1720,19 @@
               <w:jc w:val="left"/>
             </w:pPr>
             <w:r>
-              <w:t xml:space="preserve">0.582→0.750</w:t>
-            </w:r>
-          </w:p>
-        </w:tc>
-        <w:tc>
-          <w:tcPr/>
-          <w:p>
-            <w:pPr>
-              <w:pStyle w:val="Compact"/>
-              <w:jc w:val="left"/>
-            </w:pPr>
-            <w:r>
-              <w:t xml:space="preserve">+0.168年(+29%)</w:t>
+              <w:t xml:space="preserve">0.590→0.747</w:t>
+            </w:r>
+          </w:p>
+        </w:tc>
+        <w:tc>
+          <w:tcPr/>
+          <w:p>
+            <w:pPr>
+              <w:pStyle w:val="Compact"/>
+              <w:jc w:val="left"/>
+            </w:pPr>
+            <w:r>
+              <w:t xml:space="preserve">+0.157年(+27%)</w:t>
             </w:r>
           </w:p>
         </w:tc>
@@ -1784,19 +1794,19 @@
               <w:jc w:val="left"/>
             </w:pPr>
             <w:r>
-              <w:t xml:space="preserve">0.750→0.870</w:t>
-            </w:r>
-          </w:p>
-        </w:tc>
-        <w:tc>
-          <w:tcPr/>
-          <w:p>
-            <w:pPr>
-              <w:pStyle w:val="Compact"/>
-              <w:jc w:val="left"/>
-            </w:pPr>
-            <w:r>
-              <w:t xml:space="preserve">+0.120年(+16%)</w:t>
+              <w:t xml:space="preserve">0.747→0.857</w:t>
+            </w:r>
+          </w:p>
+        </w:tc>
+        <w:tc>
+          <w:tcPr/>
+          <w:p>
+            <w:pPr>
+              <w:pStyle w:val="Compact"/>
+              <w:jc w:val="left"/>
+            </w:pPr>
+            <w:r>
+              <w:t xml:space="preserve">+0.110年(+15%)</w:t>
             </w:r>
           </w:p>
         </w:tc>
@@ -1858,19 +1868,19 @@
               <w:jc w:val="left"/>
             </w:pPr>
             <w:r>
-              <w:t xml:space="preserve">0.870→1.055</w:t>
-            </w:r>
-          </w:p>
-        </w:tc>
-        <w:tc>
-          <w:tcPr/>
-          <w:p>
-            <w:pPr>
-              <w:pStyle w:val="Compact"/>
-              <w:jc w:val="left"/>
-            </w:pPr>
-            <w:r>
-              <w:t xml:space="preserve">+0.185年(+21%)</w:t>
+              <w:t xml:space="preserve">0.857→1.032</w:t>
+            </w:r>
+          </w:p>
+        </w:tc>
+        <w:tc>
+          <w:tcPr/>
+          <w:p>
+            <w:pPr>
+              <w:pStyle w:val="Compact"/>
+              <w:jc w:val="left"/>
+            </w:pPr>
+            <w:r>
+              <w:t xml:space="preserve">+0.175年(+20%)</w:t>
             </w:r>
           </w:p>
         </w:tc>
@@ -1932,19 +1942,19 @@
               <w:jc w:val="left"/>
             </w:pPr>
             <w:r>
-              <w:t xml:space="preserve">1.055→1.102</w:t>
-            </w:r>
-          </w:p>
-        </w:tc>
-        <w:tc>
-          <w:tcPr/>
-          <w:p>
-            <w:pPr>
-              <w:pStyle w:val="Compact"/>
-              <w:jc w:val="left"/>
-            </w:pPr>
-            <w:r>
-              <w:t xml:space="preserve">+0.047年(+4%)</w:t>
+              <w:t xml:space="preserve">1.032→1.064</w:t>
+            </w:r>
+          </w:p>
+        </w:tc>
+        <w:tc>
+          <w:tcPr/>
+          <w:p>
+            <w:pPr>
+              <w:pStyle w:val="Compact"/>
+              <w:jc w:val="left"/>
+            </w:pPr>
+            <w:r>
+              <w:t xml:space="preserve">+0.032年(+3%)</w:t>
             </w:r>
           </w:p>
         </w:tc>
@@ -2014,7 +2024,7 @@
                 <w:bCs/>
                 <w:b/>
               </w:rPr>
-              <w:t xml:space="preserve">0.582→1.102</w:t>
+              <w:t xml:space="preserve">0.590→1.064</w:t>
             </w:r>
           </w:p>
         </w:tc>
@@ -2030,7 +2040,7 @@
                 <w:bCs/>
                 <w:b/>
               </w:rPr>
-              <w:t xml:space="preserve">+0.520年(+89%)</w:t>
+              <w:t xml:space="preserve">+0.474年(+80%)</w:t>
             </w:r>
           </w:p>
         </w:tc>
@@ -4450,7 +4460,7 @@
         <w:pStyle w:val="Compact"/>
       </w:pPr>
       <w:r>
-        <w:t xml:space="preserve">从0.582年（2019）扩大到1.102年（2023），增长89%</w:t>
+        <w:t xml:space="preserve">从0.590年（2019）扩大到1.064年（2023），增长80%</w:t>
       </w:r>
     </w:p>
     <w:p>
@@ -4462,7 +4472,7 @@
         <w:pStyle w:val="Compact"/>
       </w:pPr>
       <w:r>
-        <w:t xml:space="preserve">主要原因是负债久期快速下降（存款短期化）</w:t>
+        <w:t xml:space="preserve">主要原因是负债久期大幅下降（从2.129年降至1.673年，-21.4%）</w:t>
       </w:r>
     </w:p>
     <w:p>
@@ -4474,7 +4484,19 @@
         <w:pStyle w:val="Compact"/>
       </w:pPr>
       <w:r>
-        <w:t xml:space="preserve">资产久期保持相对稳定</w:t>
+        <w:t xml:space="preserve">资产久期小幅上升（从2.551年升至2.605年，+2.1%）</w:t>
+      </w:r>
+    </w:p>
+    <w:p>
+      <w:pPr>
+        <w:numPr>
+          <w:ilvl w:val="0"/>
+          <w:numId w:val="1008"/>
+        </w:numPr>
+        <w:pStyle w:val="Compact"/>
+      </w:pPr>
+      <w:r>
+        <w:t xml:space="preserve">负债久期下降是久期缺口扩大的主要驱动力</w:t>
       </w:r>
     </w:p>
     <w:bookmarkEnd w:id="53"/>

</xml_diff>